<commit_message>
Chapter 4: restate the shura tafsir example more cautiously; add verification list
Co-Authored-By: Claude Opus 5.5 <noreply@anthropic.com>
Claude-Session: https://claude.ai/code/session_01LhGpaEd3xGUonrLS6HmYox
</commit_message>
<xml_diff>
--- a/chapters/الفصل_الرابع_النهائي.docx
+++ b/chapters/الفصل_الرابع_النهائي.docx
@@ -2550,7 +2550,7 @@
           <w:szCs w:val="28"/>
           <w:rtl/>
         </w:rPr>
-        <w:t xml:space="preserve">اختلف المفسرون في درجة إلزام الشورى للحاكم في تفسير ﴿وَشَاوِرْهُمْ فِي الْأَمْرِ﴾ (آل عمران:159). فالطبري، وهو من عمد التفسير الأثري وإن لم يكن ممثل المدرسة في هذا الكتاب، ينقل عن ابن عباس أن الأمر للاستحباب. والقرطبي (المدرسة الفقهية) يعرض قولين: الوجوب عند جمهور الفقهاء، والاستحباب عند فريق آخر. وابن عاشور (المدرسة اللغوية) يستدل بصيغة الأمر الصريحة على الوجوب، مقيَّدًا بوجوب الفعل لا بلزوم النتيجة.</w:t>
+        <w:t xml:space="preserve">واختلف المفسرون في حكم الأمر بالشورى وعلّته في ﴿وَشَاوِرْهُمْ فِي الْأَمْرِ﴾ (آل عمران:159). فالطبري، وهو من عمد التفسير الأثري وإن لم يكن ممثل المدرسة في هذا الكتاب، ينقل أقوالًا في علّة الأمر: تطييب نفوس الصحابة، والاستعانة برأيهم فيما لم ينزل فيه وحي، وتعليم الأمة أن تتشاور من بعده. والقرطبي (المدرسة الفقهية) يعدّ الشورى من قواعد الشريعة، وينقل عن ابن عطية أن من لا يستشير أهل العلم والدين فعزله واجب. وابن عاشور (المدرسة اللغوية) يستدل بصيغة الأمر على الوجوب، مقيَّدًا بوجوب الفعل لا بلزوم النتيجة.</w:t>
       </w:r>
     </w:p>
     <w:p>
@@ -2617,7 +2617,7 @@
           <w:sz w:val="28"/>
           <w:szCs w:val="28"/>
         </w:rPr>
-        <w:t xml:space="preserve">◆  الترجيح بما اجتمعت عليه أقوى المدارس في هذا الجانب: ويُرجَّح هنا قول ابن عاشور (وجوب الفعل لا النتيجة)، لموافقته الدلالة اللغوية الصريحة وقول جمهور الفقهاء الذي نقله القرطبي.</w:t>
+        <w:t xml:space="preserve">◆  الترجيح بما اجتمعت عليه أقوى المدارس في هذا الجانب: ويُرجَّح هنا وجوب المشاورة فعلًا لا لزوم نتيجتها، لموافقته صيغة الأمر، ولما نقله القرطبي من عدّها من قواعد الشريعة، ولأن أقوال الطبري في علّة الأمر لا تنفي وجوبه.</w:t>
       </w:r>
     </w:p>
     <w:p>

</xml_diff>